<commit_message>
Spliot and refined R code to quicken rendering.
</commit_message>
<xml_diff>
--- a/2026_earwig_allometry.docx
+++ b/2026_earwig_allometry.docx
@@ -383,20 +383,7 @@
         <w:t xml:space="preserve"> </w:t>
       </w:r>
       <w:r>
-        <w:t xml:space="preserve">(Meunier 2024;</w:t>
-      </w:r>
-      <w:r>
-        <w:t xml:space="preserve"> </w:t>
-      </w:r>
-      <w:r>
-        <w:rPr>
-          <w:b/>
-          <w:bCs/>
-        </w:rPr>
-        <w:t xml:space="preserve">kamimura2024?</w:t>
-      </w:r>
-      <w:r>
-        <w:t xml:space="preserve">)</w:t>
+        <w:t xml:space="preserve">(Kamimura 2014; Meunier 2024)</w:t>
       </w:r>
       <w:r>
         <w:t xml:space="preserve">. Because these morphs coexist within the same population, earwigs provide an opportunity to ask whether males share a common scaling relationship that differs from females, or whether any divergence is associated more strongly with one male morph. Previous studies have documented morph-specific differences in forceps exaggeration, raising the possibility that alternative male phenotypes may follow different allometric trajectories</w:t>
@@ -891,7 +878,7 @@
         </w:r>
       </w:hyperlink>
       <w:r>
-        <w:t xml:space="preserve">; Table S5; Figure S1). Treating females, brachylabic males, and macrolabic males as three phenotypic groups revealed broadly similar scaling relationships across most developmental environments. Under good diet and low density, estimated slopes were 0.36 (95% CrI: 0.18–0.55) in females, 0.43 (95% CrI: 0.21–0.66) in brachylabic males, and 0.47 (95% CrI: 0.23–0.72) in macrolabic males. Pairwise differences among groups were generally small or uncertain, with contrast intervals overlapping zero across most environments (Table S6).</w:t>
+        <w:t xml:space="preserve">; Table S5; Figure S1). Treating females, brachylabic males, and macrolabic males as three phenotypic groups revealed broadly similar scaling relationships across most developmental environments. Under good diet and low density, estimated slopes were 0.37 (95% CrI: 0.18–0.55) in females, 0.43 (95% CrI: 0.20–0.66) in brachylabic males, and 0.46 (95% CrI: 0.21–0.71) in macrolabic males. Pairwise differences among groups were generally small or uncertain, with contrast intervals overlapping zero across most environments (Table S6).</w:t>
       </w:r>
     </w:p>
     <w:p>
@@ -899,7 +886,7 @@
         <w:pStyle w:val="BodyText"/>
       </w:pPr>
       <w:r>
-        <w:t xml:space="preserve">A quadratic model had somewhat better expected out-of-sample predictive performance than the linear model (ΔELPD = 11.70, SE = 6.58; Table S4), providing some evidence of curvature in the relationship between body size and forceps length. The quadratic predictions did not substantially alter the broad comparison among phenotypic groups, although they revealed localized departures from linearity (Figure S2). Curvature was most apparent near the extremes of the observed body-size range in several macrolabic male groups, where predictions were influenced by relatively few individuals. These edge patterns should therefore be interpreted cautiously and do not necessarily imply strong curvature across the central portion of the body-size distribution. We use the linear model to summarize average condition-specific allometric exponents and treat the quadratic model as a sensitivity analysis.</w:t>
+        <w:t xml:space="preserve">A quadratic model had somewhat better expected out-of-sample predictive performance than the linear model (ΔELPD = 13.29, SE = 6.68; Table S4), providing some evidence of curvature in the relationship between body size and forceps length. The quadratic predictions did not substantially alter the broad comparison among phenotypic groups, although they revealed localized departures from linearity (Figure S2). Curvature was most apparent near the extremes of the observed body-size range in several macrolabic male groups, where predictions were influenced by relatively few individuals. These edge patterns should therefore be interpreted cautiously and do not necessarily imply strong curvature across the central portion of the body-size distribution. We use the linear model to summarize average condition-specific allometric exponents and treat the quadratic model as a sensitivity analysis.</w:t>
       </w:r>
     </w:p>
     <w:p>
@@ -907,7 +894,7 @@
         <w:pStyle w:val="BodyText"/>
       </w:pPr>
       <w:r>
-        <w:t xml:space="preserve">Across the full set of developmental environments, there was little evidence that females and brachylabic males differed consistently in allometric slope (Table S6). The contrast interval between females and brachylabic males included zero in every diet-by-density combination examined. Macrolabic male slopes were also similar to those of females and brachylabic males under most environmental conditions. The clearest exception occurred under poor diet at medium density, where the estimated slope for macrolabic males (1.23, 95% CrI: 0.75–1.70) was steeper than those estimated for females (0.33, 95% CrI: 0.14–0.49) and brachylabic males (0.26, 95% CrI: 0.04–0.48). Pairwise contrast intervals excluded zero in this environment (Table S6). This result should nevertheless be interpreted cautiously because the estimate was based on only 18 poor-diet macrolabic males at medium density (Table S1).</w:t>
+        <w:t xml:space="preserve">Across the full set of developmental environments, there was little evidence that females and brachylabic males differed consistently in allometric slope (Table S6). The contrast interval between females and brachylabic males included zero in every diet-by-density combination examined. Macrolabic male slopes were also similar to those of females and brachylabic males under most environmental conditions. The clearest exception occurred under poor diet at medium density, where the estimated slope for macrolabic males (1.23, 95% CrI: 0.77–1.73) was steeper than those estimated for females (0.33, 95% CrI: 0.15–0.49) and brachylabic males (0.26, 95% CrI: 0.04–0.49). Pairwise contrast intervals excluded zero in this environment (Table S6). This result should nevertheless be interpreted cautiously because the estimate was based on only 18 poor-diet macrolabic males at medium density (Table S1).</w:t>
       </w:r>
     </w:p>
     <w:p>
@@ -915,7 +902,7 @@
         <w:pStyle w:val="BodyText"/>
       </w:pPr>
       <w:r>
-        <w:t xml:space="preserve">Posterior median slopes for females and brachylabic males were below one in every developmental environment examined. The posterior median for macrolabic males exceeded one only under poor diet at medium density (1.23, 95% CrI: 0.75–1.70). Because this credible interval included one, the evidence that this relationship was hyperallometric rather than isometric was uncertain. The small sample of poor-diet macrolabic males further limits inference from this treatment combination (Table S1).</w:t>
+        <w:t xml:space="preserve">Posterior median slopes for females and brachylabic males were below one in every developmental environment examined. The posterior median for macrolabic males exceeded one only under poor diet at medium density (1.23, 95% CrI: 0.77–1.73). Because this credible interval included one, the evidence that this relationship was hyperallometric rather than isometric was uncertain. The small sample of poor-diet macrolabic males further limits inference from this treatment combination (Table S1).</w:t>
       </w:r>
     </w:p>
     <w:bookmarkEnd w:id="27"/>
@@ -1049,7 +1036,7 @@
         <w:t xml:space="preserve"> </w:t>
       </w:r>
       <w:r>
-        <w:t xml:space="preserve">= -0.81, 95% CrI: -0.99–0.56), providing little evidence for a consistent association between forceps expression and allometric scaling among families. Variation among rearing dishes was small (SD = 0.01, 95% CrI: 0.00–0.02), as was residual variation (SD = 0.07, 95% CrI: 0.07–0.08).</w:t>
+        <w:t xml:space="preserve">= -0.79, 95% CrI: -0.99–0.58), providing little evidence for a consistent association between forceps expression and allometric scaling among families. Variation among rearing dishes was small (SD = 0.01, 95% CrI: 0.00–0.02), as was residual variation (SD = 0.07, 95% CrI: 0.07–0.08).</w:t>
       </w:r>
     </w:p>
     <w:bookmarkEnd w:id="29"/>
@@ -1757,7 +1744,7 @@
           <w:rPr>
             <w:rStyle w:val="Hyperlink"/>
           </w:rPr>
-          <w:t xml:space="preserve">dimorphism in a clade of neotropical harvestmen: Coevolution of sexual and</w:t>
+          <w:t xml:space="preserve">dimorphism in a clade of neotropical harvestmen:</w:t>
         </w:r>
         <w:r>
           <w:rPr>
@@ -1769,7 +1756,7 @@
           <w:rPr>
             <w:rStyle w:val="Hyperlink"/>
           </w:rPr>
-          <w:t xml:space="preserve">Male</w:t>
+          <w:t xml:space="preserve">Coevolution</w:t>
         </w:r>
         <w:r>
           <w:rPr>
@@ -1781,7 +1768,7 @@
           <w:rPr>
             <w:rStyle w:val="Hyperlink"/>
           </w:rPr>
-          <w:t xml:space="preserve">dimorphism</w:t>
+          <w:t xml:space="preserve">of sexual and male dimorphism</w:t>
         </w:r>
       </w:hyperlink>
       <w:r>
@@ -2027,7 +2014,13 @@
           <w:rPr>
             <w:rStyle w:val="Hyperlink"/>
           </w:rPr>
-          <w:t xml:space="preserve">oleoptera:</w:t>
+          <w:t xml:space="preserve">Coleoptera</w:t>
+        </w:r>
+        <w:r>
+          <w:rPr>
+            <w:rStyle w:val="Hyperlink"/>
+          </w:rPr>
+          <w:t xml:space="preserve">:</w:t>
         </w:r>
         <w:r>
           <w:rPr>
@@ -2039,7 +2032,13 @@
           <w:rPr>
             <w:rStyle w:val="Hyperlink"/>
           </w:rPr>
-          <w:t xml:space="preserve">carabaeidae)</w:t>
+          <w:t xml:space="preserve">Scarabaeidae</w:t>
+        </w:r>
+        <w:r>
+          <w:rPr>
+            <w:rStyle w:val="Hyperlink"/>
+          </w:rPr>
+          <w:t xml:space="preserve">)</w:t>
         </w:r>
       </w:hyperlink>
       <w:r>
@@ -2287,7 +2286,13 @@
           <w:rPr>
             <w:rStyle w:val="Hyperlink"/>
           </w:rPr>
-          <w:t xml:space="preserve">ermaptera)</w:t>
+          <w:t xml:space="preserve">Dermaptera</w:t>
+        </w:r>
+        <w:r>
+          <w:rPr>
+            <w:rStyle w:val="Hyperlink"/>
+          </w:rPr>
+          <w:t xml:space="preserve">)</w:t>
         </w:r>
       </w:hyperlink>
       <w:r>
@@ -2524,7 +2529,13 @@
         <w:t xml:space="preserve"> </w:t>
       </w:r>
       <w:r>
-        <w:t xml:space="preserve">Stimated marginal means, aka least-squares means.</w:t>
+        <w:t xml:space="preserve">Estimated</w:t>
+      </w:r>
+      <w:r>
+        <w:t xml:space="preserve"> </w:t>
+      </w:r>
+      <w:r>
+        <w:t xml:space="preserve">marginal means, aka least-squares means.</w:t>
       </w:r>
     </w:p>
     <w:bookmarkEnd w:id="83"/>
@@ -2584,7 +2595,37 @@
           <w:rPr>
             <w:rStyle w:val="Hyperlink"/>
           </w:rPr>
-          <w:t xml:space="preserve">(dermaptera: anisolabididae)</w:t>
+          <w:t xml:space="preserve">(</w:t>
+        </w:r>
+        <w:r>
+          <w:rPr>
+            <w:rStyle w:val="Hyperlink"/>
+          </w:rPr>
+          <w:t xml:space="preserve">Dermaptera</w:t>
+        </w:r>
+        <w:r>
+          <w:rPr>
+            <w:rStyle w:val="Hyperlink"/>
+          </w:rPr>
+          <w:t xml:space="preserve">:</w:t>
+        </w:r>
+        <w:r>
+          <w:rPr>
+            <w:rStyle w:val="Hyperlink"/>
+          </w:rPr>
+          <w:t xml:space="preserve"> </w:t>
+        </w:r>
+        <w:r>
+          <w:rPr>
+            <w:rStyle w:val="Hyperlink"/>
+          </w:rPr>
+          <w:t xml:space="preserve">Anisolabididae</w:t>
+        </w:r>
+        <w:r>
+          <w:rPr>
+            <w:rStyle w:val="Hyperlink"/>
+          </w:rPr>
+          <w:t xml:space="preserve">)</w:t>
         </w:r>
       </w:hyperlink>
       <w:r>
@@ -2769,7 +2810,19 @@
           <w:rPr>
             <w:rStyle w:val="Hyperlink"/>
           </w:rPr>
-          <w:t xml:space="preserve">Itting finite mixture of scale mixture of skew-normal distributions</w:t>
+          <w:t xml:space="preserve">Fitting</w:t>
+        </w:r>
+        <w:r>
+          <w:rPr>
+            <w:rStyle w:val="Hyperlink"/>
+          </w:rPr>
+          <w:t xml:space="preserve"> </w:t>
+        </w:r>
+        <w:r>
+          <w:rPr>
+            <w:rStyle w:val="Hyperlink"/>
+          </w:rPr>
+          <w:t xml:space="preserve">finite mixture of scale mixture of skew-normal distributions</w:t>
         </w:r>
       </w:hyperlink>
       <w:r>
@@ -2942,31 +2995,7 @@
           <w:rPr>
             <w:rStyle w:val="Hyperlink"/>
           </w:rPr>
-          <w:t xml:space="preserve">Environmental and genetic determinants of the</w:t>
-        </w:r>
-        <w:r>
-          <w:rPr>
-            <w:rStyle w:val="Hyperlink"/>
-          </w:rPr>
-          <w:t xml:space="preserve"> </w:t>
-        </w:r>
-        <w:r>
-          <w:rPr>
-            <w:rStyle w:val="Hyperlink"/>
-          </w:rPr>
-          <w:t xml:space="preserve">Male</w:t>
-        </w:r>
-        <w:r>
-          <w:rPr>
-            <w:rStyle w:val="Hyperlink"/>
-          </w:rPr>
-          <w:t xml:space="preserve"> </w:t>
-        </w:r>
-        <w:r>
-          <w:rPr>
-            <w:rStyle w:val="Hyperlink"/>
-          </w:rPr>
-          <w:t xml:space="preserve">forceps length dimorphism in the</w:t>
+          <w:t xml:space="preserve">Environmental and genetic determinants of the male forceps length dimorphism in the</w:t>
         </w:r>
         <w:r>
           <w:rPr>
@@ -3146,13 +3175,31 @@
           <w:rPr>
             <w:rStyle w:val="Hyperlink"/>
           </w:rPr>
-          <w:t xml:space="preserve">ayesian model evaluation using leave-one-out cross-validation and</w:t>
+          <w:t xml:space="preserve">Bayesian</w:t>
         </w:r>
         <w:r>
           <w:rPr>
             <w:rStyle w:val="Hyperlink"/>
           </w:rPr>
           <w:t xml:space="preserve"> </w:t>
+        </w:r>
+        <w:r>
+          <w:rPr>
+            <w:rStyle w:val="Hyperlink"/>
+          </w:rPr>
+          <w:t xml:space="preserve">model evaluation using leave-one-out cross-validation and</w:t>
+        </w:r>
+        <w:r>
+          <w:rPr>
+            <w:rStyle w:val="Hyperlink"/>
+          </w:rPr>
+          <w:t xml:space="preserve"> </w:t>
+        </w:r>
+        <w:r>
+          <w:rPr>
+            <w:rStyle w:val="Hyperlink"/>
+          </w:rPr>
+          <w:t xml:space="preserve">WAIC</w:t>
         </w:r>
       </w:hyperlink>
       <w:r>
@@ -3245,7 +3292,7 @@
           <w:rPr>
             <w:rStyle w:val="Hyperlink"/>
           </w:rPr>
-          <w:t xml:space="preserve">An Improved R^</w:t>
+          <w:t xml:space="preserve">An Improved R-hat</w:t>
         </w:r>
         <w:r>
           <w:rPr>

</xml_diff>